<commit_message>
refactor: update all page components with neumorphic light theme
</commit_message>
<xml_diff>
--- a/grad_doc/5.毕业设计说明书.-2026版doc(1)_converted.docx
+++ b/grad_doc/5.毕业设计说明书.-2026版doc(1)_converted.docx
@@ -14,8 +14,6 @@
           <w:szCs w:val="72"/>
         </w:rPr>
       </w:pPr>
-      <w:bookmarkStart w:id="0" w:name="_GoBack"/>
-      <w:bookmarkEnd w:id="0"/>
       <w:r>
         <w:rPr>
           <w:rFonts w:ascii="仿宋_GB2312" w:eastAsia="仿宋_GB2312"/>
@@ -174,8 +172,22 @@
     </w:p>
     <w:p>
       <w:pPr>
+        <w:keepNext w:val="0"/>
+        <w:keepLines w:val="0"/>
+        <w:pageBreakBefore w:val="0"/>
+        <w:widowControl w:val="0"/>
+        <w:kinsoku/>
+        <w:wordWrap/>
+        <w:overflowPunct/>
+        <w:topLinePunct w:val="0"/>
+        <w:autoSpaceDE/>
+        <w:autoSpaceDN/>
+        <w:bidi w:val="0"/>
+        <w:adjustRightInd/>
+        <w:snapToGrid/>
         <w:spacing w:line="480" w:lineRule="auto"/>
         <w:ind w:firstLine="904" w:firstLineChars="300"/>
+        <w:textAlignment w:val="auto"/>
         <w:rPr>
           <w:rFonts w:hint="eastAsia" w:ascii="宋体" w:hAnsi="宋体"/>
           <w:b/>
@@ -285,7 +297,21 @@
     </w:p>
     <w:p>
       <w:pPr>
+        <w:keepNext w:val="0"/>
+        <w:keepLines w:val="0"/>
+        <w:pageBreakBefore w:val="0"/>
+        <w:widowControl w:val="0"/>
+        <w:kinsoku/>
+        <w:wordWrap/>
+        <w:overflowPunct/>
+        <w:topLinePunct w:val="0"/>
+        <w:autoSpaceDE/>
+        <w:autoSpaceDN/>
+        <w:bidi w:val="0"/>
+        <w:adjustRightInd/>
+        <w:snapToGrid/>
         <w:spacing w:line="480" w:lineRule="auto"/>
+        <w:textAlignment w:val="auto"/>
         <w:rPr>
           <w:rFonts w:hint="eastAsia"/>
           <w:sz w:val="30"/>
@@ -295,88 +321,23 @@
       </w:pPr>
       <w:r>
         <w:rPr>
-          <w:rFonts w:hint="eastAsia" w:ascii="宋体" w:hAnsi="宋体"/>
-          <w:b/>
+          <w:rFonts w:hint="eastAsia"/>
+          <w:sz w:val="30"/>
+          <w:szCs w:val="30"/>
+        </w:rPr>
+        <w:t xml:space="preserve">               </w:t>
+      </w:r>
+      <w:r>
+        <w:rPr>
+          <w:rFonts w:hint="eastAsia"/>
           <w:sz w:val="30"/>
           <w:szCs w:val="30"/>
           <w:u w:val="single"/>
-          <w:lang w:val="en-US" w:eastAsia="zh-CN"/>
-        </w:rPr>
-        <w:pict>
-          <v:shape id="_x0000_s1076" o:spid="_x0000_s1076" o:spt="63" type="#_x0000_t63" style="position:absolute;left:0pt;margin-left:149.25pt;margin-top:19.85pt;height:130.5pt;width:336pt;z-index:251665408;mso-width-relative:page;mso-height-relative:page;" coordsize="21600,21600" adj=",26508">
-            <v:path/>
-            <v:fill focussize="0,0"/>
-            <v:stroke joinstyle="miter"/>
-            <v:imagedata o:title=""/>
-            <o:lock v:ext="edit"/>
-            <v:textbox>
-              <w:txbxContent>
-                <w:p>
-                  <w:pPr>
-                    <w:spacing w:line="360" w:lineRule="auto"/>
-                    <w:ind w:firstLine="723" w:firstLineChars="300"/>
-                    <w:rPr>
-                      <w:rFonts w:hint="eastAsia"/>
-                      <w:b/>
-                      <w:bCs/>
-                      <w:color w:val="0000FF"/>
-                      <w:sz w:val="24"/>
-                    </w:rPr>
-                  </w:pPr>
-                  <w:r>
-                    <w:rPr>
-                      <w:rFonts w:hint="eastAsia"/>
-                      <w:b/>
-                      <w:bCs/>
-                      <w:color w:val="0000FF"/>
-                      <w:sz w:val="24"/>
-                    </w:rPr>
-                    <w:t>校企合作带毕业设计的要填写校内和校外两个指导教师，外聘教师标明外聘</w:t>
-                  </w:r>
-                </w:p>
-                <w:p>
-                  <w:pPr>
-                    <w:spacing w:line="360" w:lineRule="auto"/>
-                    <w:ind w:firstLine="723" w:firstLineChars="300"/>
-                    <w:rPr>
-                      <w:rFonts w:hint="eastAsia"/>
-                      <w:b/>
-                      <w:bCs/>
-                      <w:color w:val="0000FF"/>
-                      <w:sz w:val="24"/>
-                    </w:rPr>
-                  </w:pPr>
-                  <w:r>
-                    <w:rPr>
-                      <w:rFonts w:hint="eastAsia"/>
-                      <w:b/>
-                      <w:bCs/>
-                      <w:color w:val="0000FF"/>
-                      <w:sz w:val="24"/>
-                    </w:rPr>
-                    <w:t>例如：张三、李四（外聘）</w:t>
-                  </w:r>
-                </w:p>
-                <w:p>
-                  <w:pPr>
-                    <w:rPr>
-                      <w:color w:val="0000FF"/>
-                    </w:rPr>
-                  </w:pPr>
-                </w:p>
-              </w:txbxContent>
-            </v:textbox>
-          </v:shape>
-        </w:pict>
-      </w:r>
-      <w:r>
-        <w:rPr>
-          <w:rFonts w:hint="eastAsia"/>
-          <w:sz w:val="30"/>
-          <w:szCs w:val="30"/>
-        </w:rPr>
-        <w:t xml:space="preserve">               </w:t>
-      </w:r>
+        </w:rPr>
+        <w:t xml:space="preserve">                              </w:t>
+      </w:r>
+      <w:bookmarkStart w:id="0" w:name="_GoBack"/>
+      <w:bookmarkEnd w:id="0"/>
       <w:r>
         <w:rPr>
           <w:rFonts w:hint="eastAsia"/>
@@ -384,7 +345,7 @@
           <w:szCs w:val="30"/>
           <w:u w:val="single"/>
         </w:rPr>
-        <w:t xml:space="preserve">                                        </w:t>
+        <w:t xml:space="preserve">          </w:t>
       </w:r>
     </w:p>
     <w:p>
@@ -4504,7 +4465,7 @@
     <w:lsdException w:uiPriority="99" w:name="Body Text First Indent"/>
     <w:lsdException w:uiPriority="99" w:name="Body Text First Indent 2"/>
     <w:lsdException w:uiPriority="99" w:name="Note Heading"/>
-    <w:lsdException w:unhideWhenUsed="0" w:uiPriority="0" w:semiHidden="0" w:name="Body Text 2"/>
+    <w:lsdException w:qFormat="1" w:unhideWhenUsed="0" w:uiPriority="0" w:semiHidden="0" w:name="Body Text 2"/>
     <w:lsdException w:qFormat="1" w:unhideWhenUsed="0" w:uiPriority="0" w:semiHidden="0" w:name="Body Text 3"/>
     <w:lsdException w:uiPriority="99" w:name="Body Text Indent 2"/>
     <w:lsdException w:uiPriority="99" w:name="Body Text Indent 3"/>
@@ -4846,6 +4807,7 @@
   <w:style w:type="paragraph" w:styleId="11">
     <w:name w:val="Body Text 2"/>
     <w:basedOn w:val="1"/>
+    <w:qFormat/>
     <w:uiPriority w:val="0"/>
     <w:pPr>
       <w:spacing w:line="360" w:lineRule="exact"/>
@@ -5150,7 +5112,6 @@
   </customSectProps>
   <customShpExts>
     <customShpInfo spid="_x0000_s1074"/>
-    <customShpInfo spid="_x0000_s1076"/>
     <customShpInfo spid="_x0000_s1073"/>
     <customShpInfo spid="_x0000_s1069"/>
     <customShpInfo spid="_x0000_s1070"/>

</xml_diff>